<commit_message>
Clarified station host protocol to clarify core responsibilities
</commit_message>
<xml_diff>
--- a/World Cafe Facilitation Guide/Station Host Protocol.docx
+++ b/World Cafe Facilitation Guide/Station Host Protocol.docx
@@ -1,6 +1,6 @@
 
 <file path=word/document.xml><?xml version="1.0" encoding="utf-8"?>
-<w:document xmlns:wpc="http://schemas.microsoft.com/office/word/2010/wordprocessingCanvas" xmlns:cx="http://schemas.microsoft.com/office/drawing/2014/chartex" xmlns:cx1="http://schemas.microsoft.com/office/drawing/2015/9/8/chartex" xmlns:cx2="http://schemas.microsoft.com/office/drawing/2015/10/21/chartex" xmlns:cx3="http://schemas.microsoft.com/office/drawing/2016/5/9/chartex" xmlns:cx4="http://schemas.microsoft.com/office/drawing/2016/5/10/chartex" xmlns:cx5="http://schemas.microsoft.com/office/drawing/2016/5/11/chartex" xmlns:cx6="http://schemas.microsoft.com/office/drawing/2016/5/12/chartex" xmlns:cx7="http://schemas.microsoft.com/office/drawing/2016/5/13/chartex" xmlns:cx8="http://schemas.microsoft.com/office/drawing/2016/5/14/chartex" xmlns:mc="http://schemas.openxmlformats.org/markup-compatibility/2006" xmlns:aink="http://schemas.microsoft.com/office/drawing/2016/ink" xmlns:am3d="http://schemas.microsoft.com/office/drawing/2017/model3d" xmlns:o="urn:schemas-microsoft-com:office:office" xmlns:oel="http://schemas.microsoft.com/office/2019/extlst" xmlns:r="http://schemas.openxmlformats.org/officeDocument/2006/relationships" xmlns:m="http://schemas.openxmlformats.org/officeDocument/2006/math" xmlns:v="urn:schemas-microsoft-com:vml" xmlns:wp14="http://schemas.microsoft.com/office/word/2010/wordprocessingDrawing" xmlns:wp="http://schemas.openxmlformats.org/drawingml/2006/wordprocessingDrawing" xmlns:w10="urn:schemas-microsoft-com:office:word" xmlns:w="http://schemas.openxmlformats.org/wordprocessingml/2006/main" xmlns:w14="http://schemas.microsoft.com/office/word/2010/wordml" xmlns:w15="http://schemas.microsoft.com/office/word/2012/wordml" xmlns:w16cei="http://schemas.microsoft.com/office/word/2026/wordml/cei" xmlns:w16cex="http://schemas.microsoft.com/office/word/2018/wordml/cex" xmlns:w16cid="http://schemas.microsoft.com/office/word/2016/wordml/cid" xmlns:w16="http://schemas.microsoft.com/office/word/2018/wordml" xmlns:w16du="http://schemas.microsoft.com/office/word/2023/wordml/word16du" xmlns:w16sdtdh="http://schemas.microsoft.com/office/word/2020/wordml/sdtdatahash" xmlns:w16sdtfl="http://schemas.microsoft.com/office/word/2024/wordml/sdtformatlock" xmlns:w16se="http://schemas.microsoft.com/office/word/2015/wordml/symex" xmlns:wpg="http://schemas.microsoft.com/office/word/2010/wordprocessingGroup" xmlns:wpi="http://schemas.microsoft.com/office/word/2010/wordprocessingInk" xmlns:wne="http://schemas.microsoft.com/office/word/2006/wordml" xmlns:wps="http://schemas.microsoft.com/office/word/2010/wordprocessingShape" mc:Ignorable="w14 w15 w16se w16cid w16 w16cex w16sdtdh w16sdtfl w16du wp14">
+<w:document xmlns:wpc="http://schemas.microsoft.com/office/word/2010/wordprocessingCanvas" xmlns:cx="http://schemas.microsoft.com/office/drawing/2014/chartex" xmlns:cx1="http://schemas.microsoft.com/office/drawing/2015/9/8/chartex" xmlns:cx2="http://schemas.microsoft.com/office/drawing/2015/10/21/chartex" xmlns:cx3="http://schemas.microsoft.com/office/drawing/2016/5/9/chartex" xmlns:cx4="http://schemas.microsoft.com/office/drawing/2016/5/10/chartex" xmlns:cx5="http://schemas.microsoft.com/office/drawing/2016/5/11/chartex" xmlns:cx6="http://schemas.microsoft.com/office/drawing/2016/5/12/chartex" xmlns:cx7="http://schemas.microsoft.com/office/drawing/2016/5/13/chartex" xmlns:cx8="http://schemas.microsoft.com/office/drawing/2016/5/14/chartex" xmlns:mc="http://schemas.openxmlformats.org/markup-compatibility/2006" xmlns:aink="http://schemas.microsoft.com/office/drawing/2016/ink" xmlns:am3d="http://schemas.microsoft.com/office/drawing/2017/model3d" xmlns:o="urn:schemas-microsoft-com:office:office" xmlns:oel="http://schemas.microsoft.com/office/2019/extlst" xmlns:r="http://schemas.openxmlformats.org/officeDocument/2006/relationships" xmlns:m="http://schemas.openxmlformats.org/officeDocument/2006/math" xmlns:v="urn:schemas-microsoft-com:vml" xmlns:wp14="http://schemas.microsoft.com/office/word/2010/wordprocessingDrawing" xmlns:wp="http://schemas.openxmlformats.org/drawingml/2006/wordprocessingDrawing" xmlns:w10="urn:schemas-microsoft-com:office:word" xmlns:w="http://schemas.openxmlformats.org/wordprocessingml/2006/main" xmlns:w14="http://schemas.microsoft.com/office/word/2010/wordml" xmlns:w15="http://schemas.microsoft.com/office/word/2012/wordml" xmlns:w16cex="http://schemas.microsoft.com/office/word/2018/wordml/cex" xmlns:w16cid="http://schemas.microsoft.com/office/word/2016/wordml/cid" xmlns:w16="http://schemas.microsoft.com/office/word/2018/wordml" xmlns:w16du="http://schemas.microsoft.com/office/word/2023/wordml/word16du" xmlns:w16sdtdh="http://schemas.microsoft.com/office/word/2020/wordml/sdtdatahash" xmlns:w16sdtfl="http://schemas.microsoft.com/office/word/2024/wordml/sdtformatlock" xmlns:w16se="http://schemas.microsoft.com/office/word/2015/wordml/symex" xmlns:wpg="http://schemas.microsoft.com/office/word/2010/wordprocessingGroup" xmlns:wpi="http://schemas.microsoft.com/office/word/2010/wordprocessingInk" xmlns:wne="http://schemas.microsoft.com/office/word/2006/wordml" xmlns:wps="http://schemas.microsoft.com/office/word/2010/wordprocessingShape" mc:Ignorable="w14 w15 w16se w16cid w16 w16cex w16sdtdh w16sdtfl w16du wp14">
   <w:body>
     <w:p>
       <w:pPr>
@@ -148,7 +148,42 @@
               </w:rPr>
             </w:pPr>
             <w:r>
-              <w:t>As a station host, you act as a host for this station through the World Café. Your role is to ensure an open, respectful debate around your station's topic. As a neutral host, you don't participate in the discussion itself, but you can ask open questions to help the group.</w:t>
+              <w:t>As a station host</w:t>
+            </w:r>
+            <w:r>
+              <w:rPr>
+                <w:lang w:val="en-US"/>
+              </w:rPr>
+              <w:t xml:space="preserve">, you stay with one station throughout the World Café. Your role is to </w:t>
+            </w:r>
+            <w:r>
+              <w:rPr>
+                <w:u w:val="single"/>
+                <w:lang w:val="en-US"/>
+              </w:rPr>
+              <w:t>record</w:t>
+            </w:r>
+            <w:r>
+              <w:rPr>
+                <w:lang w:val="en-US"/>
+              </w:rPr>
+              <w:t xml:space="preserve"> insights consistently and to </w:t>
+            </w:r>
+            <w:r>
+              <w:rPr>
+                <w:u w:val="single"/>
+                <w:lang w:val="en-US"/>
+              </w:rPr>
+              <w:t>moderate</w:t>
+            </w:r>
+            <w:r>
+              <w:rPr>
+                <w:lang w:val="en-US"/>
+              </w:rPr>
+              <w:t xml:space="preserve"> the discussion so everyone can take part</w:t>
+            </w:r>
+            <w:r>
+              <w:t>.</w:t>
             </w:r>
           </w:p>
         </w:tc>
@@ -999,7 +1034,7 @@
                       <w:szCs w:val="19"/>
                       <w:lang w:val="en-US"/>
                     </w:rPr>
-                    <w:t>Capture</w:t>
+                    <w:t>Record</w:t>
                   </w:r>
                   <w:r>
                     <w:rPr>
@@ -1147,15 +1182,7 @@
                 <w:bCs w:val="0"/>
                 <w:color w:val="auto"/>
               </w:rPr>
-              <w:t xml:space="preserve">Every station is hosted the same way so that differences in the results reflect the conversations, not the hosts. Your neutrality and consistent </w:t>
-            </w:r>
-            <w:r>
-              <w:rPr>
-                <w:b w:val="0"/>
-                <w:bCs w:val="0"/>
-                <w:color w:val="auto"/>
-              </w:rPr>
-              <w:t>c</w:t>
+              <w:t xml:space="preserve">Hosts </w:t>
             </w:r>
             <w:r>
               <w:rPr>
@@ -1164,15 +1191,7 @@
                 <w:color w:val="auto"/>
                 <w:lang w:val="en-US"/>
               </w:rPr>
-              <w:t>apturing of insights</w:t>
-            </w:r>
-            <w:r>
-              <w:rPr>
-                <w:b w:val="0"/>
-                <w:bCs w:val="0"/>
-                <w:color w:val="auto"/>
-              </w:rPr>
-              <w:t xml:space="preserve"> are what make the material comparable across stations and usable as research data.</w:t>
+              <w:t>provide consistency. They help to transfer knowledge generated during one round to the next round. They also provide consistency in how people can participate.</w:t>
             </w:r>
           </w:p>
         </w:tc>
@@ -1196,7 +1215,7 @@
 </file>
 
 <file path=word/endnotes.xml><?xml version="1.0" encoding="utf-8"?>
-<w:endnotes xmlns:wpc="http://schemas.microsoft.com/office/word/2010/wordprocessingCanvas" xmlns:cx="http://schemas.microsoft.com/office/drawing/2014/chartex" xmlns:cx1="http://schemas.microsoft.com/office/drawing/2015/9/8/chartex" xmlns:cx2="http://schemas.microsoft.com/office/drawing/2015/10/21/chartex" xmlns:cx3="http://schemas.microsoft.com/office/drawing/2016/5/9/chartex" xmlns:cx4="http://schemas.microsoft.com/office/drawing/2016/5/10/chartex" xmlns:cx5="http://schemas.microsoft.com/office/drawing/2016/5/11/chartex" xmlns:cx6="http://schemas.microsoft.com/office/drawing/2016/5/12/chartex" xmlns:cx7="http://schemas.microsoft.com/office/drawing/2016/5/13/chartex" xmlns:cx8="http://schemas.microsoft.com/office/drawing/2016/5/14/chartex" xmlns:mc="http://schemas.openxmlformats.org/markup-compatibility/2006" xmlns:aink="http://schemas.microsoft.com/office/drawing/2016/ink" xmlns:am3d="http://schemas.microsoft.com/office/drawing/2017/model3d" xmlns:o="urn:schemas-microsoft-com:office:office" xmlns:oel="http://schemas.microsoft.com/office/2019/extlst" xmlns:r="http://schemas.openxmlformats.org/officeDocument/2006/relationships" xmlns:m="http://schemas.openxmlformats.org/officeDocument/2006/math" xmlns:v="urn:schemas-microsoft-com:vml" xmlns:wp14="http://schemas.microsoft.com/office/word/2010/wordprocessingDrawing" xmlns:wp="http://schemas.openxmlformats.org/drawingml/2006/wordprocessingDrawing" xmlns:w10="urn:schemas-microsoft-com:office:word" xmlns:w="http://schemas.openxmlformats.org/wordprocessingml/2006/main" xmlns:w14="http://schemas.microsoft.com/office/word/2010/wordml" xmlns:w15="http://schemas.microsoft.com/office/word/2012/wordml" xmlns:w16cei="http://schemas.microsoft.com/office/word/2026/wordml/cei" xmlns:w16cex="http://schemas.microsoft.com/office/word/2018/wordml/cex" xmlns:w16cid="http://schemas.microsoft.com/office/word/2016/wordml/cid" xmlns:w16="http://schemas.microsoft.com/office/word/2018/wordml" xmlns:w16du="http://schemas.microsoft.com/office/word/2023/wordml/word16du" xmlns:w16sdtdh="http://schemas.microsoft.com/office/word/2020/wordml/sdtdatahash" xmlns:w16sdtfl="http://schemas.microsoft.com/office/word/2024/wordml/sdtformatlock" xmlns:w16se="http://schemas.microsoft.com/office/word/2015/wordml/symex" xmlns:wpg="http://schemas.microsoft.com/office/word/2010/wordprocessingGroup" xmlns:wpi="http://schemas.microsoft.com/office/word/2010/wordprocessingInk" xmlns:wne="http://schemas.microsoft.com/office/word/2006/wordml" xmlns:wps="http://schemas.microsoft.com/office/word/2010/wordprocessingShape" mc:Ignorable="w14 w15 w16se w16cid w16 w16cex w16sdtdh w16sdtfl w16du wp14">
+<w:endnotes xmlns:wpc="http://schemas.microsoft.com/office/word/2010/wordprocessingCanvas" xmlns:cx="http://schemas.microsoft.com/office/drawing/2014/chartex" xmlns:cx1="http://schemas.microsoft.com/office/drawing/2015/9/8/chartex" xmlns:cx2="http://schemas.microsoft.com/office/drawing/2015/10/21/chartex" xmlns:cx3="http://schemas.microsoft.com/office/drawing/2016/5/9/chartex" xmlns:cx4="http://schemas.microsoft.com/office/drawing/2016/5/10/chartex" xmlns:cx5="http://schemas.microsoft.com/office/drawing/2016/5/11/chartex" xmlns:cx6="http://schemas.microsoft.com/office/drawing/2016/5/12/chartex" xmlns:cx7="http://schemas.microsoft.com/office/drawing/2016/5/13/chartex" xmlns:cx8="http://schemas.microsoft.com/office/drawing/2016/5/14/chartex" xmlns:mc="http://schemas.openxmlformats.org/markup-compatibility/2006" xmlns:aink="http://schemas.microsoft.com/office/drawing/2016/ink" xmlns:am3d="http://schemas.microsoft.com/office/drawing/2017/model3d" xmlns:o="urn:schemas-microsoft-com:office:office" xmlns:oel="http://schemas.microsoft.com/office/2019/extlst" xmlns:r="http://schemas.openxmlformats.org/officeDocument/2006/relationships" xmlns:m="http://schemas.openxmlformats.org/officeDocument/2006/math" xmlns:v="urn:schemas-microsoft-com:vml" xmlns:wp14="http://schemas.microsoft.com/office/word/2010/wordprocessingDrawing" xmlns:wp="http://schemas.openxmlformats.org/drawingml/2006/wordprocessingDrawing" xmlns:w10="urn:schemas-microsoft-com:office:word" xmlns:w="http://schemas.openxmlformats.org/wordprocessingml/2006/main" xmlns:w14="http://schemas.microsoft.com/office/word/2010/wordml" xmlns:w15="http://schemas.microsoft.com/office/word/2012/wordml" xmlns:w16cex="http://schemas.microsoft.com/office/word/2018/wordml/cex" xmlns:w16cid="http://schemas.microsoft.com/office/word/2016/wordml/cid" xmlns:w16="http://schemas.microsoft.com/office/word/2018/wordml" xmlns:w16du="http://schemas.microsoft.com/office/word/2023/wordml/word16du" xmlns:w16sdtdh="http://schemas.microsoft.com/office/word/2020/wordml/sdtdatahash" xmlns:w16sdtfl="http://schemas.microsoft.com/office/word/2024/wordml/sdtformatlock" xmlns:w16se="http://schemas.microsoft.com/office/word/2015/wordml/symex" xmlns:wpg="http://schemas.microsoft.com/office/word/2010/wordprocessingGroup" xmlns:wpi="http://schemas.microsoft.com/office/word/2010/wordprocessingInk" xmlns:wne="http://schemas.microsoft.com/office/word/2006/wordml" xmlns:wps="http://schemas.microsoft.com/office/word/2010/wordprocessingShape" mc:Ignorable="w14 w15 w16se w16cid w16 w16cex w16sdtdh w16sdtfl w16du wp14">
   <w:endnote w:type="separator" w:id="-1">
     <w:p>
       <w:r>
@@ -1215,7 +1234,7 @@
 </file>
 
 <file path=word/footer1.xml><?xml version="1.0" encoding="utf-8"?>
-<w:ftr xmlns:wpc="http://schemas.microsoft.com/office/word/2010/wordprocessingCanvas" xmlns:cx="http://schemas.microsoft.com/office/drawing/2014/chartex" xmlns:cx1="http://schemas.microsoft.com/office/drawing/2015/9/8/chartex" xmlns:cx2="http://schemas.microsoft.com/office/drawing/2015/10/21/chartex" xmlns:cx3="http://schemas.microsoft.com/office/drawing/2016/5/9/chartex" xmlns:cx4="http://schemas.microsoft.com/office/drawing/2016/5/10/chartex" xmlns:cx5="http://schemas.microsoft.com/office/drawing/2016/5/11/chartex" xmlns:cx6="http://schemas.microsoft.com/office/drawing/2016/5/12/chartex" xmlns:cx7="http://schemas.microsoft.com/office/drawing/2016/5/13/chartex" xmlns:cx8="http://schemas.microsoft.com/office/drawing/2016/5/14/chartex" xmlns:mc="http://schemas.openxmlformats.org/markup-compatibility/2006" xmlns:aink="http://schemas.microsoft.com/office/drawing/2016/ink" xmlns:am3d="http://schemas.microsoft.com/office/drawing/2017/model3d" xmlns:o="urn:schemas-microsoft-com:office:office" xmlns:oel="http://schemas.microsoft.com/office/2019/extlst" xmlns:r="http://schemas.openxmlformats.org/officeDocument/2006/relationships" xmlns:m="http://schemas.openxmlformats.org/officeDocument/2006/math" xmlns:v="urn:schemas-microsoft-com:vml" xmlns:wp14="http://schemas.microsoft.com/office/word/2010/wordprocessingDrawing" xmlns:wp="http://schemas.openxmlformats.org/drawingml/2006/wordprocessingDrawing" xmlns:w10="urn:schemas-microsoft-com:office:word" xmlns:w="http://schemas.openxmlformats.org/wordprocessingml/2006/main" xmlns:w14="http://schemas.microsoft.com/office/word/2010/wordml" xmlns:w15="http://schemas.microsoft.com/office/word/2012/wordml" xmlns:w16cei="http://schemas.microsoft.com/office/word/2026/wordml/cei" xmlns:w16cex="http://schemas.microsoft.com/office/word/2018/wordml/cex" xmlns:w16cid="http://schemas.microsoft.com/office/word/2016/wordml/cid" xmlns:w16="http://schemas.microsoft.com/office/word/2018/wordml" xmlns:w16du="http://schemas.microsoft.com/office/word/2023/wordml/word16du" xmlns:w16sdtdh="http://schemas.microsoft.com/office/word/2020/wordml/sdtdatahash" xmlns:w16sdtfl="http://schemas.microsoft.com/office/word/2024/wordml/sdtformatlock" xmlns:w16se="http://schemas.microsoft.com/office/word/2015/wordml/symex" xmlns:wpg="http://schemas.microsoft.com/office/word/2010/wordprocessingGroup" xmlns:wpi="http://schemas.microsoft.com/office/word/2010/wordprocessingInk" xmlns:wne="http://schemas.microsoft.com/office/word/2006/wordml" xmlns:wps="http://schemas.microsoft.com/office/word/2010/wordprocessingShape" mc:Ignorable="w14 w15 w16se w16cid w16 w16cex w16sdtdh w16sdtfl w16du wp14">
+<w:ftr xmlns:wpc="http://schemas.microsoft.com/office/word/2010/wordprocessingCanvas" xmlns:cx="http://schemas.microsoft.com/office/drawing/2014/chartex" xmlns:cx1="http://schemas.microsoft.com/office/drawing/2015/9/8/chartex" xmlns:cx2="http://schemas.microsoft.com/office/drawing/2015/10/21/chartex" xmlns:cx3="http://schemas.microsoft.com/office/drawing/2016/5/9/chartex" xmlns:cx4="http://schemas.microsoft.com/office/drawing/2016/5/10/chartex" xmlns:cx5="http://schemas.microsoft.com/office/drawing/2016/5/11/chartex" xmlns:cx6="http://schemas.microsoft.com/office/drawing/2016/5/12/chartex" xmlns:cx7="http://schemas.microsoft.com/office/drawing/2016/5/13/chartex" xmlns:cx8="http://schemas.microsoft.com/office/drawing/2016/5/14/chartex" xmlns:mc="http://schemas.openxmlformats.org/markup-compatibility/2006" xmlns:aink="http://schemas.microsoft.com/office/drawing/2016/ink" xmlns:am3d="http://schemas.microsoft.com/office/drawing/2017/model3d" xmlns:o="urn:schemas-microsoft-com:office:office" xmlns:oel="http://schemas.microsoft.com/office/2019/extlst" xmlns:r="http://schemas.openxmlformats.org/officeDocument/2006/relationships" xmlns:m="http://schemas.openxmlformats.org/officeDocument/2006/math" xmlns:v="urn:schemas-microsoft-com:vml" xmlns:wp14="http://schemas.microsoft.com/office/word/2010/wordprocessingDrawing" xmlns:wp="http://schemas.openxmlformats.org/drawingml/2006/wordprocessingDrawing" xmlns:w10="urn:schemas-microsoft-com:office:word" xmlns:w="http://schemas.openxmlformats.org/wordprocessingml/2006/main" xmlns:w14="http://schemas.microsoft.com/office/word/2010/wordml" xmlns:w15="http://schemas.microsoft.com/office/word/2012/wordml" xmlns:w16cex="http://schemas.microsoft.com/office/word/2018/wordml/cex" xmlns:w16cid="http://schemas.microsoft.com/office/word/2016/wordml/cid" xmlns:w16="http://schemas.microsoft.com/office/word/2018/wordml" xmlns:w16du="http://schemas.microsoft.com/office/word/2023/wordml/word16du" xmlns:w16sdtdh="http://schemas.microsoft.com/office/word/2020/wordml/sdtdatahash" xmlns:w16sdtfl="http://schemas.microsoft.com/office/word/2024/wordml/sdtformatlock" xmlns:w16se="http://schemas.microsoft.com/office/word/2015/wordml/symex" xmlns:wpg="http://schemas.microsoft.com/office/word/2010/wordprocessingGroup" xmlns:wpi="http://schemas.microsoft.com/office/word/2010/wordprocessingInk" xmlns:wne="http://schemas.microsoft.com/office/word/2006/wordml" xmlns:wps="http://schemas.microsoft.com/office/word/2010/wordprocessingShape" mc:Ignorable="w14 w15 w16se w16cid w16 w16cex w16sdtdh w16sdtfl w16du wp14">
   <w:p>
     <w:pPr>
       <w:spacing w:before="40" w:after="20"/>
@@ -1294,7 +1313,7 @@
 </file>
 
 <file path=word/footnotes.xml><?xml version="1.0" encoding="utf-8"?>
-<w:footnotes xmlns:wpc="http://schemas.microsoft.com/office/word/2010/wordprocessingCanvas" xmlns:cx="http://schemas.microsoft.com/office/drawing/2014/chartex" xmlns:cx1="http://schemas.microsoft.com/office/drawing/2015/9/8/chartex" xmlns:cx2="http://schemas.microsoft.com/office/drawing/2015/10/21/chartex" xmlns:cx3="http://schemas.microsoft.com/office/drawing/2016/5/9/chartex" xmlns:cx4="http://schemas.microsoft.com/office/drawing/2016/5/10/chartex" xmlns:cx5="http://schemas.microsoft.com/office/drawing/2016/5/11/chartex" xmlns:cx6="http://schemas.microsoft.com/office/drawing/2016/5/12/chartex" xmlns:cx7="http://schemas.microsoft.com/office/drawing/2016/5/13/chartex" xmlns:cx8="http://schemas.microsoft.com/office/drawing/2016/5/14/chartex" xmlns:mc="http://schemas.openxmlformats.org/markup-compatibility/2006" xmlns:aink="http://schemas.microsoft.com/office/drawing/2016/ink" xmlns:am3d="http://schemas.microsoft.com/office/drawing/2017/model3d" xmlns:o="urn:schemas-microsoft-com:office:office" xmlns:oel="http://schemas.microsoft.com/office/2019/extlst" xmlns:r="http://schemas.openxmlformats.org/officeDocument/2006/relationships" xmlns:m="http://schemas.openxmlformats.org/officeDocument/2006/math" xmlns:v="urn:schemas-microsoft-com:vml" xmlns:wp14="http://schemas.microsoft.com/office/word/2010/wordprocessingDrawing" xmlns:wp="http://schemas.openxmlformats.org/drawingml/2006/wordprocessingDrawing" xmlns:w10="urn:schemas-microsoft-com:office:word" xmlns:w="http://schemas.openxmlformats.org/wordprocessingml/2006/main" xmlns:w14="http://schemas.microsoft.com/office/word/2010/wordml" xmlns:w15="http://schemas.microsoft.com/office/word/2012/wordml" xmlns:w16cei="http://schemas.microsoft.com/office/word/2026/wordml/cei" xmlns:w16cex="http://schemas.microsoft.com/office/word/2018/wordml/cex" xmlns:w16cid="http://schemas.microsoft.com/office/word/2016/wordml/cid" xmlns:w16="http://schemas.microsoft.com/office/word/2018/wordml" xmlns:w16du="http://schemas.microsoft.com/office/word/2023/wordml/word16du" xmlns:w16sdtdh="http://schemas.microsoft.com/office/word/2020/wordml/sdtdatahash" xmlns:w16sdtfl="http://schemas.microsoft.com/office/word/2024/wordml/sdtformatlock" xmlns:w16se="http://schemas.microsoft.com/office/word/2015/wordml/symex" xmlns:wpg="http://schemas.microsoft.com/office/word/2010/wordprocessingGroup" xmlns:wpi="http://schemas.microsoft.com/office/word/2010/wordprocessingInk" xmlns:wne="http://schemas.microsoft.com/office/word/2006/wordml" xmlns:wps="http://schemas.microsoft.com/office/word/2010/wordprocessingShape" mc:Ignorable="w14 w15 w16se w16cid w16 w16cex w16sdtdh w16sdtfl w16du wp14">
+<w:footnotes xmlns:wpc="http://schemas.microsoft.com/office/word/2010/wordprocessingCanvas" xmlns:cx="http://schemas.microsoft.com/office/drawing/2014/chartex" xmlns:cx1="http://schemas.microsoft.com/office/drawing/2015/9/8/chartex" xmlns:cx2="http://schemas.microsoft.com/office/drawing/2015/10/21/chartex" xmlns:cx3="http://schemas.microsoft.com/office/drawing/2016/5/9/chartex" xmlns:cx4="http://schemas.microsoft.com/office/drawing/2016/5/10/chartex" xmlns:cx5="http://schemas.microsoft.com/office/drawing/2016/5/11/chartex" xmlns:cx6="http://schemas.microsoft.com/office/drawing/2016/5/12/chartex" xmlns:cx7="http://schemas.microsoft.com/office/drawing/2016/5/13/chartex" xmlns:cx8="http://schemas.microsoft.com/office/drawing/2016/5/14/chartex" xmlns:mc="http://schemas.openxmlformats.org/markup-compatibility/2006" xmlns:aink="http://schemas.microsoft.com/office/drawing/2016/ink" xmlns:am3d="http://schemas.microsoft.com/office/drawing/2017/model3d" xmlns:o="urn:schemas-microsoft-com:office:office" xmlns:oel="http://schemas.microsoft.com/office/2019/extlst" xmlns:r="http://schemas.openxmlformats.org/officeDocument/2006/relationships" xmlns:m="http://schemas.openxmlformats.org/officeDocument/2006/math" xmlns:v="urn:schemas-microsoft-com:vml" xmlns:wp14="http://schemas.microsoft.com/office/word/2010/wordprocessingDrawing" xmlns:wp="http://schemas.openxmlformats.org/drawingml/2006/wordprocessingDrawing" xmlns:w10="urn:schemas-microsoft-com:office:word" xmlns:w="http://schemas.openxmlformats.org/wordprocessingml/2006/main" xmlns:w14="http://schemas.microsoft.com/office/word/2010/wordml" xmlns:w15="http://schemas.microsoft.com/office/word/2012/wordml" xmlns:w16cex="http://schemas.microsoft.com/office/word/2018/wordml/cex" xmlns:w16cid="http://schemas.microsoft.com/office/word/2016/wordml/cid" xmlns:w16="http://schemas.microsoft.com/office/word/2018/wordml" xmlns:w16du="http://schemas.microsoft.com/office/word/2023/wordml/word16du" xmlns:w16sdtdh="http://schemas.microsoft.com/office/word/2020/wordml/sdtdatahash" xmlns:w16sdtfl="http://schemas.microsoft.com/office/word/2024/wordml/sdtformatlock" xmlns:w16se="http://schemas.microsoft.com/office/word/2015/wordml/symex" xmlns:wpg="http://schemas.microsoft.com/office/word/2010/wordprocessingGroup" xmlns:wpi="http://schemas.microsoft.com/office/word/2010/wordprocessingInk" xmlns:wne="http://schemas.microsoft.com/office/word/2006/wordml" xmlns:wps="http://schemas.microsoft.com/office/word/2010/wordprocessingShape" mc:Ignorable="w14 w15 w16se w16cid w16 w16cex w16sdtdh w16sdtfl w16du wp14">
   <w:footnote w:type="separator" w:id="-1">
     <w:p>
       <w:r>
@@ -1313,7 +1332,7 @@
 </file>
 
 <file path=word/header1.xml><?xml version="1.0" encoding="utf-8"?>
-<w:hdr xmlns:wpc="http://schemas.microsoft.com/office/word/2010/wordprocessingCanvas" xmlns:cx="http://schemas.microsoft.com/office/drawing/2014/chartex" xmlns:cx1="http://schemas.microsoft.com/office/drawing/2015/9/8/chartex" xmlns:cx2="http://schemas.microsoft.com/office/drawing/2015/10/21/chartex" xmlns:cx3="http://schemas.microsoft.com/office/drawing/2016/5/9/chartex" xmlns:cx4="http://schemas.microsoft.com/office/drawing/2016/5/10/chartex" xmlns:cx5="http://schemas.microsoft.com/office/drawing/2016/5/11/chartex" xmlns:cx6="http://schemas.microsoft.com/office/drawing/2016/5/12/chartex" xmlns:cx7="http://schemas.microsoft.com/office/drawing/2016/5/13/chartex" xmlns:cx8="http://schemas.microsoft.com/office/drawing/2016/5/14/chartex" xmlns:mc="http://schemas.openxmlformats.org/markup-compatibility/2006" xmlns:aink="http://schemas.microsoft.com/office/drawing/2016/ink" xmlns:am3d="http://schemas.microsoft.com/office/drawing/2017/model3d" xmlns:o="urn:schemas-microsoft-com:office:office" xmlns:oel="http://schemas.microsoft.com/office/2019/extlst" xmlns:r="http://schemas.openxmlformats.org/officeDocument/2006/relationships" xmlns:m="http://schemas.openxmlformats.org/officeDocument/2006/math" xmlns:v="urn:schemas-microsoft-com:vml" xmlns:wp14="http://schemas.microsoft.com/office/word/2010/wordprocessingDrawing" xmlns:wp="http://schemas.openxmlformats.org/drawingml/2006/wordprocessingDrawing" xmlns:w10="urn:schemas-microsoft-com:office:word" xmlns:w="http://schemas.openxmlformats.org/wordprocessingml/2006/main" xmlns:w14="http://schemas.microsoft.com/office/word/2010/wordml" xmlns:w15="http://schemas.microsoft.com/office/word/2012/wordml" xmlns:w16cei="http://schemas.microsoft.com/office/word/2026/wordml/cei" xmlns:w16cex="http://schemas.microsoft.com/office/word/2018/wordml/cex" xmlns:w16cid="http://schemas.microsoft.com/office/word/2016/wordml/cid" xmlns:w16="http://schemas.microsoft.com/office/word/2018/wordml" xmlns:w16du="http://schemas.microsoft.com/office/word/2023/wordml/word16du" xmlns:w16sdtdh="http://schemas.microsoft.com/office/word/2020/wordml/sdtdatahash" xmlns:w16sdtfl="http://schemas.microsoft.com/office/word/2024/wordml/sdtformatlock" xmlns:w16se="http://schemas.microsoft.com/office/word/2015/wordml/symex" xmlns:wpg="http://schemas.microsoft.com/office/word/2010/wordprocessingGroup" xmlns:wpi="http://schemas.microsoft.com/office/word/2010/wordprocessingInk" xmlns:wne="http://schemas.microsoft.com/office/word/2006/wordml" xmlns:wps="http://schemas.microsoft.com/office/word/2010/wordprocessingShape" mc:Ignorable="w14 w15 w16se w16cid w16 w16cex w16sdtdh w16sdtfl w16du wp14">
+<w:hdr xmlns:wpc="http://schemas.microsoft.com/office/word/2010/wordprocessingCanvas" xmlns:cx="http://schemas.microsoft.com/office/drawing/2014/chartex" xmlns:cx1="http://schemas.microsoft.com/office/drawing/2015/9/8/chartex" xmlns:cx2="http://schemas.microsoft.com/office/drawing/2015/10/21/chartex" xmlns:cx3="http://schemas.microsoft.com/office/drawing/2016/5/9/chartex" xmlns:cx4="http://schemas.microsoft.com/office/drawing/2016/5/10/chartex" xmlns:cx5="http://schemas.microsoft.com/office/drawing/2016/5/11/chartex" xmlns:cx6="http://schemas.microsoft.com/office/drawing/2016/5/12/chartex" xmlns:cx7="http://schemas.microsoft.com/office/drawing/2016/5/13/chartex" xmlns:cx8="http://schemas.microsoft.com/office/drawing/2016/5/14/chartex" xmlns:mc="http://schemas.openxmlformats.org/markup-compatibility/2006" xmlns:aink="http://schemas.microsoft.com/office/drawing/2016/ink" xmlns:am3d="http://schemas.microsoft.com/office/drawing/2017/model3d" xmlns:o="urn:schemas-microsoft-com:office:office" xmlns:oel="http://schemas.microsoft.com/office/2019/extlst" xmlns:r="http://schemas.openxmlformats.org/officeDocument/2006/relationships" xmlns:m="http://schemas.openxmlformats.org/officeDocument/2006/math" xmlns:v="urn:schemas-microsoft-com:vml" xmlns:wp14="http://schemas.microsoft.com/office/word/2010/wordprocessingDrawing" xmlns:wp="http://schemas.openxmlformats.org/drawingml/2006/wordprocessingDrawing" xmlns:w10="urn:schemas-microsoft-com:office:word" xmlns:w="http://schemas.openxmlformats.org/wordprocessingml/2006/main" xmlns:w14="http://schemas.microsoft.com/office/word/2010/wordml" xmlns:w15="http://schemas.microsoft.com/office/word/2012/wordml" xmlns:w16cex="http://schemas.microsoft.com/office/word/2018/wordml/cex" xmlns:w16cid="http://schemas.microsoft.com/office/word/2016/wordml/cid" xmlns:w16="http://schemas.microsoft.com/office/word/2018/wordml" xmlns:w16du="http://schemas.microsoft.com/office/word/2023/wordml/word16du" xmlns:w16sdtdh="http://schemas.microsoft.com/office/word/2020/wordml/sdtdatahash" xmlns:w16sdtfl="http://schemas.microsoft.com/office/word/2024/wordml/sdtformatlock" xmlns:w16se="http://schemas.microsoft.com/office/word/2015/wordml/symex" xmlns:wpg="http://schemas.microsoft.com/office/word/2010/wordprocessingGroup" xmlns:wpi="http://schemas.microsoft.com/office/word/2010/wordprocessingInk" xmlns:wne="http://schemas.microsoft.com/office/word/2006/wordml" xmlns:wps="http://schemas.microsoft.com/office/word/2010/wordprocessingShape" mc:Ignorable="w14 w15 w16se w16cid w16 w16cex w16sdtdh w16sdtfl w16du wp14">
   <w:p>
     <w:pPr>
       <w:spacing w:before="160" w:after="40"/>
@@ -1539,7 +1558,7 @@
 </file>
 
 <file path=word/numbering.xml><?xml version="1.0" encoding="utf-8"?>
-<w:numbering xmlns:wpc="http://schemas.microsoft.com/office/word/2010/wordprocessingCanvas" xmlns:cx="http://schemas.microsoft.com/office/drawing/2014/chartex" xmlns:cx1="http://schemas.microsoft.com/office/drawing/2015/9/8/chartex" xmlns:cx2="http://schemas.microsoft.com/office/drawing/2015/10/21/chartex" xmlns:cx3="http://schemas.microsoft.com/office/drawing/2016/5/9/chartex" xmlns:cx4="http://schemas.microsoft.com/office/drawing/2016/5/10/chartex" xmlns:cx5="http://schemas.microsoft.com/office/drawing/2016/5/11/chartex" xmlns:cx6="http://schemas.microsoft.com/office/drawing/2016/5/12/chartex" xmlns:cx7="http://schemas.microsoft.com/office/drawing/2016/5/13/chartex" xmlns:cx8="http://schemas.microsoft.com/office/drawing/2016/5/14/chartex" xmlns:mc="http://schemas.openxmlformats.org/markup-compatibility/2006" xmlns:aink="http://schemas.microsoft.com/office/drawing/2016/ink" xmlns:am3d="http://schemas.microsoft.com/office/drawing/2017/model3d" xmlns:o="urn:schemas-microsoft-com:office:office" xmlns:oel="http://schemas.microsoft.com/office/2019/extlst" xmlns:r="http://schemas.openxmlformats.org/officeDocument/2006/relationships" xmlns:m="http://schemas.openxmlformats.org/officeDocument/2006/math" xmlns:v="urn:schemas-microsoft-com:vml" xmlns:wp14="http://schemas.microsoft.com/office/word/2010/wordprocessingDrawing" xmlns:wp="http://schemas.openxmlformats.org/drawingml/2006/wordprocessingDrawing" xmlns:w10="urn:schemas-microsoft-com:office:word" xmlns:w="http://schemas.openxmlformats.org/wordprocessingml/2006/main" xmlns:w14="http://schemas.microsoft.com/office/word/2010/wordml" xmlns:w15="http://schemas.microsoft.com/office/word/2012/wordml" xmlns:w16cei="http://schemas.microsoft.com/office/word/2026/wordml/cei" xmlns:w16cex="http://schemas.microsoft.com/office/word/2018/wordml/cex" xmlns:w16cid="http://schemas.microsoft.com/office/word/2016/wordml/cid" xmlns:w16="http://schemas.microsoft.com/office/word/2018/wordml" xmlns:w16du="http://schemas.microsoft.com/office/word/2023/wordml/word16du" xmlns:w16sdtdh="http://schemas.microsoft.com/office/word/2020/wordml/sdtdatahash" xmlns:w16sdtfl="http://schemas.microsoft.com/office/word/2024/wordml/sdtformatlock" xmlns:w16se="http://schemas.microsoft.com/office/word/2015/wordml/symex" xmlns:wpg="http://schemas.microsoft.com/office/word/2010/wordprocessingGroup" xmlns:wpi="http://schemas.microsoft.com/office/word/2010/wordprocessingInk" xmlns:wne="http://schemas.microsoft.com/office/word/2006/wordml" xmlns:wps="http://schemas.microsoft.com/office/word/2010/wordprocessingShape" mc:Ignorable="w14 w15 w16se w16cid w16 w16cex w16sdtdh w16sdtfl w16du wp14">
+<w:numbering xmlns:wpc="http://schemas.microsoft.com/office/word/2010/wordprocessingCanvas" xmlns:cx="http://schemas.microsoft.com/office/drawing/2014/chartex" xmlns:cx1="http://schemas.microsoft.com/office/drawing/2015/9/8/chartex" xmlns:cx2="http://schemas.microsoft.com/office/drawing/2015/10/21/chartex" xmlns:cx3="http://schemas.microsoft.com/office/drawing/2016/5/9/chartex" xmlns:cx4="http://schemas.microsoft.com/office/drawing/2016/5/10/chartex" xmlns:cx5="http://schemas.microsoft.com/office/drawing/2016/5/11/chartex" xmlns:cx6="http://schemas.microsoft.com/office/drawing/2016/5/12/chartex" xmlns:cx7="http://schemas.microsoft.com/office/drawing/2016/5/13/chartex" xmlns:cx8="http://schemas.microsoft.com/office/drawing/2016/5/14/chartex" xmlns:mc="http://schemas.openxmlformats.org/markup-compatibility/2006" xmlns:aink="http://schemas.microsoft.com/office/drawing/2016/ink" xmlns:am3d="http://schemas.microsoft.com/office/drawing/2017/model3d" xmlns:o="urn:schemas-microsoft-com:office:office" xmlns:oel="http://schemas.microsoft.com/office/2019/extlst" xmlns:r="http://schemas.openxmlformats.org/officeDocument/2006/relationships" xmlns:m="http://schemas.openxmlformats.org/officeDocument/2006/math" xmlns:v="urn:schemas-microsoft-com:vml" xmlns:wp14="http://schemas.microsoft.com/office/word/2010/wordprocessingDrawing" xmlns:wp="http://schemas.openxmlformats.org/drawingml/2006/wordprocessingDrawing" xmlns:w10="urn:schemas-microsoft-com:office:word" xmlns:w="http://schemas.openxmlformats.org/wordprocessingml/2006/main" xmlns:w14="http://schemas.microsoft.com/office/word/2010/wordml" xmlns:w15="http://schemas.microsoft.com/office/word/2012/wordml" xmlns:w16cex="http://schemas.microsoft.com/office/word/2018/wordml/cex" xmlns:w16cid="http://schemas.microsoft.com/office/word/2016/wordml/cid" xmlns:w16="http://schemas.microsoft.com/office/word/2018/wordml" xmlns:w16du="http://schemas.microsoft.com/office/word/2023/wordml/word16du" xmlns:w16sdtdh="http://schemas.microsoft.com/office/word/2020/wordml/sdtdatahash" xmlns:w16sdtfl="http://schemas.microsoft.com/office/word/2024/wordml/sdtformatlock" xmlns:w16se="http://schemas.microsoft.com/office/word/2015/wordml/symex" xmlns:wpg="http://schemas.microsoft.com/office/word/2010/wordprocessingGroup" xmlns:wpi="http://schemas.microsoft.com/office/word/2010/wordprocessingInk" xmlns:wne="http://schemas.microsoft.com/office/word/2006/wordml" xmlns:wps="http://schemas.microsoft.com/office/word/2010/wordprocessingShape" mc:Ignorable="w14 w15 w16se w16cid w16 w16cex w16sdtdh w16sdtfl w16du wp14">
   <w:abstractNum w:abstractNumId="0" w15:restartNumberingAfterBreak="0">
     <w:nsid w:val="1A684F2A"/>
     <w:multiLevelType w:val="hybridMultilevel"/>

</xml_diff>

<commit_message>
Host protocol updated to emphasize that hosts should not provide their own views or opinions
</commit_message>
<xml_diff>
--- a/World Cafe Facilitation Guide/Station Host Protocol.docx
+++ b/World Cafe Facilitation Guide/Station Host Protocol.docx
@@ -569,8 +569,19 @@
                       <w:bCs/>
                       <w:color w:val="0F2A33"/>
                       <w:szCs w:val="19"/>
+                      <w:lang w:val="en-US"/>
                     </w:rPr>
-                    <w:t>Listen to understand.</w:t>
+                    <w:t>Withhold your own view and opinions</w:t>
+                  </w:r>
+                  <w:r>
+                    <w:rPr>
+                      <w:rFonts w:cs="Arial"/>
+                      <w:b/>
+                      <w:bCs/>
+                      <w:color w:val="0F2A33"/>
+                      <w:szCs w:val="19"/>
+                    </w:rPr>
+                    <w:t>.</w:t>
                   </w:r>
                 </w:p>
                 <w:p>
@@ -588,7 +599,31 @@
                     </w:rPr>
                   </w:pPr>
                   <w:r>
-                    <w:t>Listen for meaning rather than waiting to reply or to correct.</w:t>
+                    <w:rPr>
+                      <w:lang w:val="en-US"/>
+                    </w:rPr>
+                    <w:t>Instead, f</w:t>
+                  </w:r>
+                  <w:r>
+                    <w:rPr>
+                      <w:lang w:val="en-US"/>
+                    </w:rPr>
+                    <w:t xml:space="preserve">ocus on </w:t>
+                  </w:r>
+                  <w:r>
+                    <w:rPr>
+                      <w:lang w:val="en-US"/>
+                    </w:rPr>
+                    <w:t xml:space="preserve">consistently </w:t>
+                  </w:r>
+                  <w:r>
+                    <w:rPr>
+                      <w:lang w:val="en-US"/>
+                    </w:rPr>
+                    <w:t>recording insights and moderation the discussion</w:t>
+                  </w:r>
+                  <w:r>
+                    <w:t>.</w:t>
                   </w:r>
                 </w:p>
               </w:tc>
@@ -764,126 +799,7 @@
                       <w:sz w:val="16"/>
                       <w:szCs w:val="16"/>
                       <w:shd w:val="clear" w:color="auto" w:fill="159A93"/>
-                    </w:rPr>
-                  </w:pPr>
-                </w:p>
-              </w:tc>
-              <w:tc>
-                <w:tcPr>
-                  <w:tcW w:w="9820" w:type="dxa"/>
-                  <w:tcMar>
-                    <w:top w:w="115" w:type="dxa"/>
-                    <w:left w:w="115" w:type="dxa"/>
-                    <w:bottom w:w="115" w:type="dxa"/>
-                    <w:right w:w="115" w:type="dxa"/>
-                  </w:tcMar>
-                </w:tcPr>
-                <w:p>
-                  <w:pPr>
-                    <w:spacing w:after="60"/>
-                    <w:rPr>
-                      <w:rFonts w:cs="Arial"/>
-                      <w:b/>
-                      <w:bCs/>
-                      <w:color w:val="0F2A33"/>
-                      <w:szCs w:val="19"/>
                       <w:lang w:val="en-US"/>
-                    </w:rPr>
-                  </w:pPr>
-                  <w:r>
-                    <w:rPr>
-                      <w:rFonts w:cs="Arial"/>
-                      <w:b/>
-                      <w:bCs/>
-                      <w:color w:val="0F2A33"/>
-                      <w:szCs w:val="19"/>
-                    </w:rPr>
-                    <w:t>Remain objective and neutral.</w:t>
-                  </w:r>
-                </w:p>
-                <w:p>
-                  <w:pPr>
-                    <w:pStyle w:val="ListParagraph"/>
-                    <w:rPr>
-                      <w:rFonts w:cs="Arial"/>
-                      <w:b/>
-                      <w:bCs/>
-                      <w:color w:val="FFFFFF"/>
-                      <w:sz w:val="16"/>
-                      <w:szCs w:val="16"/>
-                      <w:shd w:val="clear" w:color="auto" w:fill="159A93"/>
-                      <w:lang w:val="en-US"/>
-                    </w:rPr>
-                  </w:pPr>
-                  <w:r>
-                    <w:t>Keep your own views out of it; treat every position even-handedly.</w:t>
-                  </w:r>
-                  <w:r>
-                    <w:rPr>
-                      <w:lang w:val="en-US"/>
-                    </w:rPr>
-                    <w:t xml:space="preserve"> Do not participate in the discussion itself.</w:t>
-                  </w:r>
-                </w:p>
-              </w:tc>
-            </w:tr>
-            <w:tr>
-              <w:tc>
-                <w:tcPr>
-                  <w:tcW w:w="970" w:type="dxa"/>
-                  <w:vAlign w:val="center"/>
-                </w:tcPr>
-                <w:tbl>
-                  <w:tblPr>
-                    <w:tblStyle w:val="TableGrid"/>
-                    <w:tblW w:w="0" w:type="auto"/>
-                    <w:tblBorders>
-                      <w:top w:val="none" w:sz="0" w:space="0" w:color="auto"/>
-                      <w:left w:val="none" w:sz="0" w:space="0" w:color="auto"/>
-                      <w:bottom w:val="none" w:sz="0" w:space="0" w:color="auto"/>
-                      <w:right w:val="none" w:sz="0" w:space="0" w:color="auto"/>
-                      <w:insideH w:val="none" w:sz="0" w:space="0" w:color="auto"/>
-                      <w:insideV w:val="none" w:sz="0" w:space="0" w:color="auto"/>
-                    </w:tblBorders>
-                    <w:shd w:val="clear" w:color="auto" w:fill="159A93"/>
-                    <w:tblCellMar>
-                      <w:top w:w="58" w:type="dxa"/>
-                      <w:bottom w:w="58" w:type="dxa"/>
-                    </w:tblCellMar>
-                    <w:tblLook w:val="04A0" w:firstRow="1" w:lastRow="0" w:firstColumn="1" w:lastColumn="0" w:noHBand="0" w:noVBand="1"/>
-                  </w:tblPr>
-                  <w:tblGrid>
-                    <w:gridCol w:w="744"/>
-                  </w:tblGrid>
-                  <w:tr>
-                    <w:tc>
-                      <w:tcPr>
-                        <w:tcW w:w="744" w:type="dxa"/>
-                        <w:shd w:val="clear" w:color="auto" w:fill="159A93"/>
-                      </w:tcPr>
-                      <w:p>
-                        <w:pPr>
-                          <w:pStyle w:val="Digit"/>
-                        </w:pPr>
-                        <w:r>
-                          <w:t>6</w:t>
-                        </w:r>
-                      </w:p>
-                    </w:tc>
-                  </w:tr>
-                </w:tbl>
-                <w:p>
-                  <w:pPr>
-                    <w:spacing w:before="160" w:after="60"/>
-                    <w:jc w:val="center"/>
-                    <w:rPr>
-                      <w:rFonts w:cs="Arial"/>
-                      <w:b/>
-                      <w:bCs/>
-                      <w:color w:val="FFFFFF"/>
-                      <w:sz w:val="16"/>
-                      <w:szCs w:val="16"/>
-                      <w:shd w:val="clear" w:color="auto" w:fill="159A93"/>
                     </w:rPr>
                   </w:pPr>
                 </w:p>
@@ -980,7 +896,7 @@
                           <w:pStyle w:val="Digit"/>
                         </w:pPr>
                         <w:r>
-                          <w:t>7</w:t>
+                          <w:t>6</w:t>
                         </w:r>
                       </w:p>
                     </w:tc>
@@ -1062,7 +978,13 @@
                     </w:rPr>
                   </w:pPr>
                   <w:r>
-                    <w:t>Capture the group's insights in their words, on the station sheet, as they emerge</w:t>
+                    <w:t>Capture the group's insights on the station sheet as they emerge</w:t>
+                  </w:r>
+                  <w:r>
+                    <w:rPr>
+                      <w:lang w:val="en-US"/>
+                    </w:rPr>
+                    <w:t xml:space="preserve"> (writing clearly)</w:t>
                   </w:r>
                   <w:r>
                     <w:rPr>

</xml_diff>